<commit_message>
Fix BMAD install guide link so the PDF is not blocked by content filters
The guide linked to the Claude Code guide as a local file, which Word exported as a file-launch action; replace it with a regular GitHub URL and re-export the PDF.

Co-Authored-By: Claude Sonnet 5.5 <noreply@anthropic.com>
</commit_message>
<xml_diff>
--- a/docs/bmad-install-guide.docx
+++ b/docs/bmad-install-guide.docx
@@ -715,7 +715,7 @@
           <w:noProof/>
         </w:rPr>
         <w:drawing>
-          <wp:inline distT="0" distB="0" distL="0" distR="0" wp14:anchorId="237634A8" wp14:editId="08CECC3A">
+          <wp:inline distT="0" distB="0" distL="0" distR="0" wp14:anchorId="7997DC1A" wp14:editId="51E3D3AC">
             <wp:extent cx="4320000" cy="857739"/>
             <wp:effectExtent l="0" t="0" r="0" b="0"/>
             <wp:docPr id="1" name="Picture 1"/>
@@ -1127,7 +1127,7 @@
           <w:noProof/>
         </w:rPr>
         <w:drawing>
-          <wp:inline distT="0" distB="0" distL="0" distR="0" wp14:anchorId="007D9395" wp14:editId="6C936BAE">
+          <wp:inline distT="0" distB="0" distL="0" distR="0" wp14:anchorId="2C3C3BA3" wp14:editId="1DC8A100">
             <wp:extent cx="5400000" cy="3032215"/>
             <wp:effectExtent l="0" t="0" r="0" b="0"/>
             <wp:docPr id="2" name="Picture 2"/>
@@ -1313,7 +1313,7 @@
           <w:noProof/>
         </w:rPr>
         <w:drawing>
-          <wp:inline distT="0" distB="0" distL="0" distR="0" wp14:anchorId="6E96E706" wp14:editId="2E29BD74">
+          <wp:inline distT="0" distB="0" distL="0" distR="0" wp14:anchorId="34D54D19" wp14:editId="75FB9896">
             <wp:extent cx="4320000" cy="3303915"/>
             <wp:effectExtent l="0" t="0" r="0" b="0"/>
             <wp:docPr id="3" name="Picture 3"/>
@@ -1982,7 +1982,7 @@
           <w:noProof/>
         </w:rPr>
         <w:drawing>
-          <wp:inline distT="0" distB="0" distL="0" distR="0" wp14:anchorId="1255D0C1" wp14:editId="013625C7">
+          <wp:inline distT="0" distB="0" distL="0" distR="0" wp14:anchorId="5019B0E5" wp14:editId="04A42B85">
             <wp:extent cx="4320000" cy="3476006"/>
             <wp:effectExtent l="0" t="0" r="0" b="0"/>
             <wp:docPr id="4" name="Picture 4"/>
@@ -2044,7 +2044,7 @@
           <w:noProof/>
         </w:rPr>
         <w:drawing>
-          <wp:inline distT="0" distB="0" distL="0" distR="0" wp14:anchorId="1553F679" wp14:editId="512335C2">
+          <wp:inline distT="0" distB="0" distL="0" distR="0" wp14:anchorId="29263721" wp14:editId="3A1DAE1A">
             <wp:extent cx="2160000" cy="332757"/>
             <wp:effectExtent l="0" t="0" r="0" b="0"/>
             <wp:docPr id="5" name="Picture 5"/>
@@ -2106,7 +2106,7 @@
           <w:noProof/>
         </w:rPr>
         <w:drawing>
-          <wp:inline distT="0" distB="0" distL="0" distR="0" wp14:anchorId="4ED2227D" wp14:editId="6E81F0D2">
+          <wp:inline distT="0" distB="0" distL="0" distR="0" wp14:anchorId="1FACEF5E" wp14:editId="4867AD68">
             <wp:extent cx="2520000" cy="1728376"/>
             <wp:effectExtent l="0" t="0" r="0" b="0"/>
             <wp:docPr id="6" name="Picture 6"/>
@@ -2370,7 +2370,7 @@
           <w:noProof/>
         </w:rPr>
         <w:drawing>
-          <wp:inline distT="0" distB="0" distL="0" distR="0" wp14:anchorId="0A009936" wp14:editId="540255E7">
+          <wp:inline distT="0" distB="0" distL="0" distR="0" wp14:anchorId="4C745AD4" wp14:editId="26CD4E02">
             <wp:extent cx="3240000" cy="2667892"/>
             <wp:effectExtent l="0" t="0" r="0" b="0"/>
             <wp:docPr id="7" name="Picture 7"/>
@@ -3007,31 +3007,31 @@
       </w:rPr>
     </w:lvl>
   </w:abstractNum>
-  <w:num w:numId="1" w16cid:durableId="1719086073">
+  <w:num w:numId="1" w16cid:durableId="1206792827">
     <w:abstractNumId w:val="8"/>
   </w:num>
-  <w:num w:numId="2" w16cid:durableId="1798599339">
+  <w:num w:numId="2" w16cid:durableId="1162816809">
     <w:abstractNumId w:val="6"/>
   </w:num>
-  <w:num w:numId="3" w16cid:durableId="1751348451">
+  <w:num w:numId="3" w16cid:durableId="1818646038">
     <w:abstractNumId w:val="5"/>
   </w:num>
-  <w:num w:numId="4" w16cid:durableId="1231112344">
+  <w:num w:numId="4" w16cid:durableId="284703387">
     <w:abstractNumId w:val="4"/>
   </w:num>
-  <w:num w:numId="5" w16cid:durableId="1320842376">
+  <w:num w:numId="5" w16cid:durableId="583342698">
     <w:abstractNumId w:val="7"/>
   </w:num>
-  <w:num w:numId="6" w16cid:durableId="239756820">
+  <w:num w:numId="6" w16cid:durableId="1409038783">
     <w:abstractNumId w:val="3"/>
   </w:num>
-  <w:num w:numId="7" w16cid:durableId="601760236">
+  <w:num w:numId="7" w16cid:durableId="996760828">
     <w:abstractNumId w:val="2"/>
   </w:num>
-  <w:num w:numId="8" w16cid:durableId="1000281142">
+  <w:num w:numId="8" w16cid:durableId="175852545">
     <w:abstractNumId w:val="1"/>
   </w:num>
-  <w:num w:numId="9" w16cid:durableId="2133205894">
+  <w:num w:numId="9" w16cid:durableId="1703356775">
     <w:abstractNumId w:val="0"/>
   </w:num>
 </w:numbering>

</xml_diff>